<commit_message>
Make report wording follow the data, not just the numbers
After the simulator rewrite the report's figures updated but its hardcoded
judgments did not. It called a 28% repeat rate "very high", said "very few"
customers placed a single order when 72% did, described revenue that grew
61% across the year as "relatively stable", and attributed a March peak to
holiday shopping. It also still explained the simulation as random
assignment of transactions, which the rewrite removed.

The repeat-rate descriptor, trend direction, holiday attribution, and the
single-order phrasing are now chosen from the data. Growth is attributed to
the customer base building up only when the data shows customers were
acquired throughout the year. Report regenerated.

Co-Authored-By: Claude Opus 5 <noreply@anthropic.com>
</commit_message>
<xml_diff>
--- a/reports/Wayfair_Sales_Performance_Report.docx
+++ b/reports/Wayfair_Sales_Performance_Report.docx
@@ -434,7 +434,7 @@
           <w:color w:val="444444"/>
           <w:sz w:val="21"/>
         </w:rPr>
-        <w:t>28.0% of customers placed more than one order, indicating strong simulated repeat-purchase behavior across the customer base.</w:t>
+        <w:t>28.0% of customers placed more than one order, a moderate repeat-purchase rate.</w:t>
       </w:r>
     </w:p>
     <w:p>
@@ -447,7 +447,7 @@
           <w:color w:val="444444"/>
           <w:sz w:val="21"/>
         </w:rPr>
-        <w:t>Monthly revenue is relatively stable, ranging from roughly $43K to $95K per month with no sustained downward trend across the 12 full months of data.</w:t>
+        <w:t>Monthly revenue ranged from roughly $43K to $95K per month and trended upward across the 12 full months of data.</w:t>
       </w:r>
     </w:p>
     <w:p>
@@ -523,7 +523,7 @@
           <w:color w:val="444444"/>
           <w:sz w:val="21"/>
         </w:rPr>
-        <w:t>Revenue peaked in March 2026 at $95,126, consistent with a holiday shopping pattern, and dipped to its lowest full-month point in July 2025 at $43,149. Order counts follow a similar rhythm, ranging from 122 to 227 orders per month. Overall, the trend shows healthy month-to-month variation without a sustained decline.</w:t>
+        <w:t>Revenue peaked in March 2026 at $95,126, which does not coincide with the usual holiday peak for home goods, and dipped to its lowest full-month point in July 2025 at $43,149. Order counts follow a similar rhythm, ranging from 122 to 227 orders per month. Comparing the first 3 months with the last 3, average monthly revenue grew by 61%. In this simulated dataset, much of that growth reflects the active customer base building up over the year, since new customers are acquired every month while earlier ones keep buying.</w:t>
       </w:r>
     </w:p>
     <w:p>
@@ -2060,7 +2060,7 @@
           <w:color w:val="444444"/>
           <w:sz w:val="21"/>
         </w:rPr>
-        <w:t>The distribution below shows how many orders each of the 1,500 customers placed over the twelve-month period. Most customers placed between 1 and 2 orders; very few placed only one.</w:t>
+        <w:t>The distribution below shows how many orders each of the 1,500 customers placed over the twelve-month period. Most customers (72%) placed a single order.</w:t>
       </w:r>
     </w:p>
     <w:p>
@@ -2112,7 +2112,7 @@
           <w:color w:val="444444"/>
           <w:sz w:val="21"/>
         </w:rPr>
-        <w:t>Only 1080 of 1,500 customers (72.0%) placed a single order, while 28.0% placed two or more — a high repeat rate, consistent with the simulation's design assumptions rather than a claim about real Wayfair shopper behavior.</w:t>
+        <w:t>1,080 of 1,500 customers (72.0%) placed a single order, while 28.0% placed two or more — a moderate repeat rate. That is a plausible level for big-ticket home goods such as area rugs, though it reflects the simulation's assumptions rather than observed Wayfair shopper behavior.</w:t>
       </w:r>
     </w:p>
     <w:p>
@@ -3714,7 +3714,7 @@
           <w:color w:val="444444"/>
           <w:sz w:val="19"/>
         </w:rPr>
-        <w:t>One caveat carries over from the simulation's design: because transactions are assigned to customers at random, the 28.0% repeat rate is far higher than real big-ticket home goods retail would produce. Segment sizes here therefore describe the simulated population, not expected real-world customer distribution.</w:t>
+        <w:t>One caveat carries over from the simulation's design: customer purchase rates and lifetimes are drawn from assumed distributions rather than observed from real shoppers. Segment sizes here therefore describe the simulated population, not the expected real-world customer distribution.</w:t>
       </w:r>
     </w:p>
     <w:p>
@@ -3764,7 +3764,7 @@
           <w:color w:val="444444"/>
           <w:sz w:val="21"/>
         </w:rPr>
-        <w:t>Order volume is fairly stable month over month, with a clear seasonal peak in March, typical of holiday-driven home goods demand.</w:t>
+        <w:t>Monthly revenue trended upward over the year, largely because the simulated customer base builds up as new customers are acquired each month.</w:t>
       </w:r>
     </w:p>
     <w:p>
@@ -3777,7 +3777,7 @@
           <w:color w:val="444444"/>
           <w:sz w:val="21"/>
         </w:rPr>
-        <w:t>Simulated repeat-purchase behavior is very high (28.0%); in a real dataset this would be worth validating, since real-world repeat rates for big-ticket home goods like area rugs are often lower.</w:t>
+        <w:t>28.0% of customers bought more than once, a moderate repeat rate. That is a plausible level for big-ticket home goods such as area rugs, though it reflects the simulation's assumptions rather than observed Wayfair shopper behavior.</w:t>
       </w:r>
     </w:p>
     <w:p>
@@ -3803,7 +3803,7 @@
           <w:color w:val="444444"/>
           <w:sz w:val="21"/>
         </w:rPr>
-        <w:t>With segmentation in place, modeling seasonality more formally or tuning the simulator toward realistic repeat rates would be the natural next steps.</w:t>
+        <w:t>The project extends this descriptive view with individual-level churn prediction, cohort retention tracking, and campaign ROI modeling.</w:t>
       </w:r>
     </w:p>
     <w:p/>

</xml_diff>